<commit_message>
Fix typos and improve clarity in Rorty's "Contingencia, ironía y solidaridad" text
</commit_message>
<xml_diff>
--- a/DOCX/Rorty 1991 Contigengencia, ironía y solidaridad.docx
+++ b/DOCX/Rorty 1991 Contigengencia, ironía y solidaridad.docx
@@ -35,7 +35,7 @@
         <w:t xml:space="preserve"> </w:t>
       </w:r>
       <w:r>
-        <w:t xml:space="preserve">La intención de unir lo público y lo privado subyace tanto al intento platónico de responder a la pregunta «Por qué va en interés de uno ser justo», como a l al tesis cristiana según la cual se logra la perfecta realización de sí mismo a través del servicio a los demás… Nos piden que creamos que lo más importante es lo que tenemos en común con los demás; que las fuentes de la realización privada y las fuentes de la realización privada y las de la solidaridad humana son las mismas»</w:t>
+        <w:t xml:space="preserve">La intención de unir lo público y lo privado subyace tanto al intento platónico de responder a la pregunta «Por qué va en interés de uno ser justo», como a la tesis cristiana según la cual se logra la perfecta realización de sí mismo a través del servicio a los demás… Nos piden que creamos que lo más importante es lo que tenemos en común con los demás; que las fuentes de la realización privada y las fuentes de la realización privada y las de la solidaridad humana son las mismas»</w:t>
       </w:r>
     </w:p>
     <w:p>
@@ -68,7 +68,7 @@
         <w:t xml:space="preserve"> </w:t>
       </w:r>
       <w:r>
-        <w:t xml:space="preserve">Para estos, en el nivel «más profundo» del yo no hay sentimiento de alguno de solidaridad humana, ese sentimiento es un «mero» artificio de solidaridad humana.</w:t>
+        <w:t xml:space="preserve">Para éstos, en el nivel «más profundo» del yo no hay sentimiento de alguno de solidaridad humana, ese sentimiento es un «mero» artificio de solidaridad humana.</w:t>
       </w:r>
     </w:p>
     <w:p>
@@ -525,7 +525,14 @@
         <w:t xml:space="preserve"> </w:t>
       </w:r>
       <w:r>
-        <w:t xml:space="preserve">Más o menos al mismo tiempo, los poetas románticos mostraban qué es lo que ocurre cuando no se concibe ya el arte como una imitación, sino más bien como una creación del artista. Los poetas reclamaban para el arte el lugar que en la cultura tradicional había ocupado la religión y la filosofía, el lugar que la ilustración había reclamado para la ciencia. El precedente que los románticos fijaron dio a su reclamo una inicial plausibilidad. El verdadero. El verdadero papel que han desempeñado las novelas, los poemas, las obras de teatro, las pinturas, las estatuas y la arquitectura en los movimientos sociales del último siglo y medio, le ha conferido una plausibilidad aún mayor.</w:t>
+        <w:rPr>
+          <w:bCs/>
+          <w:b/>
+        </w:rPr>
+        <w:t xml:space="preserve">Más o menos al mismo tiempo, los poetas románticos mostraban qué es lo que ocurre cuando no se concibe ya el arte como una imitación, sino más bien como una creación del artista</w:t>
+      </w:r>
+      <w:r>
+        <w:t xml:space="preserve">. Los poetas reclamaban para el arte el lugar que en la cultura tradicional había ocupado la religión y la filosofía, el lugar que la ilustración había reclamado para la ciencia. El precedente que los románticos fijaron dio a su reclamo una inicial plausibilidad. El verdadero papel que han desempeñado las novelas, los poemas, las obras de teatro, las pinturas, las estatuas y la arquitectura en los movimientos sociales del último siglo y medio, le ha conferido una plausibilidad aún mayor.</w:t>
       </w:r>
     </w:p>
     <w:p>
@@ -571,7 +578,7 @@
         <w:t xml:space="preserve"> </w:t>
       </w:r>
       <w:r>
-        <w:t xml:space="preserve">Ahora esas dos tendencias han aunado fuerzas y han alcanzado la hegemonía cultural. .. Este desarrollo ha conducido a una escisión dentro de la filosofía. Algunos filósofos han permanecido fieles a la Ilustración, y siguen identificándose con la causa de la ciencia. Ven a la antigua lucha entre la ciencia y la religión, entre la razón y la sinrazón, como una lucha que aún pervive y ha tomado ahora la forma de una lucha entre la razón y todas aquellas fuerzas que, dentro de la cultura, conciben a la verdad como una cosa que se encuentra más que una cosa que se halla. Estos filósofos consideran a la ciencia como la actividad humana paradigmática, e insisten en que la ciencia natural descubre la verdad, no la hace. Estiman que «hacer la verdad» es una expresión meramente metafórica y que induce al error.</w:t>
+        <w:t xml:space="preserve">Ahora esas dos tendencias han aunado fuerzas y han alcanzado la hegemonía cultural. ... Este desarrollo ha conducido a una escisión dentro de la filosofía. Algunos filósofos han permanecido fieles a la Ilustración, y siguen identificándose con la causa de la ciencia. Ven a la antigua lucha entre la ciencia y la religión, entre la razón y la sinrazón, como una lucha que aún pervive y ha tomado ahora la forma de una lucha entre la razón y todas aquellas fuerzas que, dentro de la cultura, conciben a la verdad como una cosa que se encuentra más que una cosa que se halla. Estos filósofos consideran a la ciencia como la actividad humana paradigmática, e insisten en que la ciencia natural descubre la verdad, no la hace. Estiman que «hacer la verdad» es una expresión meramente metafórica y que induce al error.</w:t>
       </w:r>
       <w:r>
         <w:t xml:space="preserve"> </w:t>
@@ -763,6 +770,10 @@
         <w:t xml:space="preserve"> </w:t>
       </w:r>
       <w:r>
+        <w:rPr>
+          <w:bCs/>
+          <w:b/>
+        </w:rPr>
         <w:t xml:space="preserve">Hay que distinguir entre la afirmación de que el mundo está ahí afuera y la afirmación de que</w:t>
       </w:r>
       <w:r>
@@ -1047,6 +1058,10 @@
         <w:t xml:space="preserve"> </w:t>
       </w:r>
       <w:r>
+        <w:rPr>
+          <w:bCs/>
+          <w:b/>
+        </w:rPr>
         <w:t xml:space="preserve">Lo que de verdadero tiene esa afirmación es, precisamente, que los lenguajes son hechos, no hallados, y que la verdad es una propiedad de entidades lingüísticas, de proposiciones.</w:t>
       </w:r>
     </w:p>
@@ -1055,7 +1070,20 @@
         <w:pStyle w:val="BodyText"/>
       </w:pPr>
       <w:r>
-        <w:t xml:space="preserve">… Lo que los románticos expresaban al afirmar que la imaginación, y no la razón, es la facultad humana fundamental era el descubrimiento de que el principal instrumento de cambio cultural es el talento de hablar de forma diferente más que el talento de argumentar bien. Lo que los utopistas políticos han percibido desde la Revolución Francesa no es que una naturaleza humana subyacente y perenne hubiese estado anulada o reprimida por instituciones sociales «innaturales» o «irracionales», sino el cambio de lenguajes y de otras prácticas sociales pueden producir seres humanos de una especie que antes nunca había existido. Los idealistas alemanes, los revolucionarios franceses y los poetas románticos tenían en común la oscura percepción de que seres humanos cuyo lenguaje cambió de forma tal que ya no hablaban de sí mismos como sujetos a poderes no humanos, se convertían con ello en un nuevo tipo de seres humanos.</w:t>
+        <w:t xml:space="preserve">… Lo que los románticos expresaban al afirmar que la imaginación, y no la razón, es la facultad humana fundamental era el descubrimiento de que el principal instrumento de cambio cultural es el talento de</w:t>
+      </w:r>
+      <w:r>
+        <w:t xml:space="preserve"> </w:t>
+      </w:r>
+      <w:r>
+        <w:rPr>
+          <w:bCs/>
+          <w:b/>
+        </w:rPr>
+        <w:t xml:space="preserve">hablar de forma diferente más que el talento de argumentar bien</w:t>
+      </w:r>
+      <w:r>
+        <w:t xml:space="preserve">. Lo que los utopistas políticos han percibido desde la Revolución Francesa no es que una naturaleza humana subyacente y perenne hubiese estado anulada o reprimida por instituciones sociales «innaturales» o «irracionales», sino el cambio de lenguajes y de otras prácticas sociales pueden producir seres humanos de una especie que antes nunca había existido. Los idealistas alemanes, los revolucionarios franceses y los poetas románticos tenían en común la oscura percepción de que seres humanos cuyo lenguaje cambió de forma tal que ya no hablaban de sí mismos como sujetos a poderes no humanos, se convertían con ello en un nuevo tipo de seres humanos.</w:t>
       </w:r>
     </w:p>
     <w:p>
@@ -1101,7 +1129,36 @@
         <w:t xml:space="preserve"> </w:t>
       </w:r>
       <w:r>
-        <w:t xml:space="preserve">Decir que no hay una cosa tal como una naturaleza intrínseca no es decir que la naturaleza intrínseca de la realidad ha resultado ser —sorprendentemente —extrínseca— Decir que deberíamos excluir la idea de que la verdad está ahí afuera esperando a ser descubierta, no es decir que hemos descubierto que, a</w:t>
+        <w:t xml:space="preserve">Decir que no</w:t>
+      </w:r>
+      <w:r>
+        <w:t xml:space="preserve"> </w:t>
+      </w:r>
+      <w:r>
+        <w:rPr>
+          <w:bCs/>
+          <w:b/>
+        </w:rPr>
+        <w:t xml:space="preserve">hay una cosa tal como una naturaleza intrínseca</w:t>
+      </w:r>
+      <w:r>
+        <w:t xml:space="preserve"> </w:t>
+      </w:r>
+      <w:r>
+        <w:t xml:space="preserve">no es decir que la naturaleza intrínseca de la realidad ha resultado ser —sorprendentemente —extrínseca— Decir que deberíamos</w:t>
+      </w:r>
+      <w:r>
+        <w:t xml:space="preserve"> </w:t>
+      </w:r>
+      <w:r>
+        <w:rPr>
+          <w:bCs/>
+          <w:b/>
+        </w:rPr>
+        <w:t xml:space="preserve">excluir la idea de que la verdad está ahí afuera esperando a ser descubierta</w:t>
+      </w:r>
+      <w:r>
+        <w:t xml:space="preserve">, no es decir que hemos descubierto que, a</w:t>
       </w:r>
       <w:r>
         <w:rPr>
@@ -1173,20 +1230,43 @@
         <w:t xml:space="preserve"> </w:t>
       </w:r>
       <w:r>
-        <w:t xml:space="preserve">con la noción del lenguaje como algo que puede mantener una relación de adecuación o de inadecuación con el mundo o con el yo. Porque Davidson rompe con la noción de que el lenguaje es un</w:t>
-      </w:r>
-      <w:r>
-        <w:t xml:space="preserve"> </w:t>
-      </w:r>
-      <w:r>
-        <w:rPr>
+        <w:t xml:space="preserve">con la noción del lenguaje como algo que puede mantener una relación de adecuación o de inadecuación con el mundo o con el yo. Porque</w:t>
+      </w:r>
+      <w:r>
+        <w:t xml:space="preserve"> </w:t>
+      </w:r>
+      <w:r>
+        <w:rPr>
+          <w:bCs/>
+          <w:b/>
+        </w:rPr>
+        <w:t xml:space="preserve">Davidson rompe con la noción de que el lenguaje es un</w:t>
+      </w:r>
+      <w:r>
+        <w:rPr>
+          <w:bCs/>
+          <w:b/>
+        </w:rPr>
+        <w:t xml:space="preserve"> </w:t>
+      </w:r>
+      <w:r>
+        <w:rPr>
+          <w:bCs/>
+          <w:b/>
           <w:iCs/>
           <w:i/>
         </w:rPr>
         <w:t xml:space="preserve">medio</w:t>
       </w:r>
       <w:r>
-        <w:t xml:space="preserve">: un medio de representación o de expresión.</w:t>
+        <w:rPr>
+          <w:bCs/>
+          <w:b/>
+        </w:rPr>
+        <w:t xml:space="preserve">: un medio de representación o de expresió</w:t>
+      </w:r>
+      <w:r>
+        <w:t xml:space="preserve">n.</w:t>
       </w:r>
     </w:p>
     <w:p>
@@ -1315,7 +1395,20 @@
         <w:t xml:space="preserve">tercer elemento, mediador entre el yo y el mundo</w:t>
       </w:r>
       <w:r>
-        <w:t xml:space="preserve">. Se pensó que ese giro en dirección del lenguaje constituía un paso progresivo de adaptación. Se creyó que era así porque parecía más fácil dar una explicación causal de la emergencia, en el marco de la evolución, de organismos que utilizan el lenguaje, que dar una explicación metafísica de la emergencia de la conciencia a partir de lo no consciente. Pero en sí misma esa sustitución es ineficaz. Porque si persistimos en la imagen del lenguaje como un medio, como algo que se encuentra entre el yo y la realidad no humana con la que el yo procura estar en contacto, no habremos hecho progresos alguno.</w:t>
+        <w:t xml:space="preserve">. Se pensó que ese giro en dirección del lenguaje constituía un paso progresivo de adaptación. Se creyó que era así porque parecía más fácil dar una explicación causal de la emergencia, en el marco de la evolución, de organismos que utilizan el lenguaje, que dar una explicación metafísica de la emergencia de la conciencia a partir de lo no consciente. Pero en sí misma esa sustitución es ineficaz.</w:t>
+      </w:r>
+      <w:r>
+        <w:t xml:space="preserve"> </w:t>
+      </w:r>
+      <w:r>
+        <w:rPr>
+          <w:bCs/>
+          <w:b/>
+        </w:rPr>
+        <w:t xml:space="preserve">Porque si persistimos en la imagen del lenguaje como un medio, como algo que se encuentra entre el yo y la realidad no humana con la que el yo procura estar en contacto, no habremos hecho progresos alguno</w:t>
+      </w:r>
+      <w:r>
+        <w:t xml:space="preserve">.</w:t>
       </w:r>
     </w:p>
     <w:p>
@@ -1494,7 +1587,7 @@
         <w:t xml:space="preserve"> </w:t>
       </w:r>
       <w:r>
-        <w:t xml:space="preserve">[…] las posibilidades de reglamentar o de enseñar ese proceso no son mayores que ls posibilidades de reglamentar o de enseñar el proceso de crear nuevas teorías para hacer frente a nuevos datos; porque ese proceso […]</w:t>
+        <w:t xml:space="preserve">[…] las posibilidades de reglamentar o de enseñar ese proceso no son mayores que la posibilidades de reglamentar o de enseñar el proceso de crear nuevas teorías para hacer frente a nuevos datos; porque ese proceso […]</w:t>
       </w:r>
     </w:p>
     <w:p>
@@ -1606,7 +1699,20 @@
         <w:t xml:space="preserve"> </w:t>
       </w:r>
       <w:r>
-        <w:t xml:space="preserve">Esta línea de pensamiento acerca del lenguaje es análoga a la concepción de Ryle y de Dannett según la cual empleamos una terminología mentalista sencillamente estamos empleando un léxico eficaz —característica léxica de lo que Dannett llama «actitud intencional» para predecir lo que un organismo verosímilmente hará o dirá al concurrir diversas circunstancias—</w:t>
+        <w:t xml:space="preserve">Esta línea de pensamiento acerca del lenguaje es análoga a la concepción de Ryle y de Dannett según la cual empleamos una terminología mentalista sencillamente estamos empleando un léxico eficaz —característica léxica de lo que</w:t>
+      </w:r>
+      <w:r>
+        <w:t xml:space="preserve"> </w:t>
+      </w:r>
+      <w:r>
+        <w:rPr>
+          <w:bCs/>
+          <w:b/>
+        </w:rPr>
+        <w:t xml:space="preserve">Dannett llama «actitud intencional» para predecir lo que un organismo verosímilmente hará o dirá al concurrir diversas circunstancias</w:t>
+      </w:r>
+      <w:r>
+        <w:t xml:space="preserve">—</w:t>
       </w:r>
     </w:p>
     <w:p>
@@ -1744,7 +1850,7 @@
         <w:t xml:space="preserve"> </w:t>
       </w:r>
       <w:r>
-        <w:t xml:space="preserve">Para aceptar esta analogía debemos seguir a Mary Hesse en su idea de que las revoluciones científicas son «redescripciones metafóricas» de la naturaleza antes que intelecciones de la naturaleza intrínseca de la naturaleza. Además, debemos resistir ala tendencia de pensar que las redescripciones de la realidad que ofrecen la ciencia física o la ciencia biológica contemporáneas se aproximan de algún modo a «las cosas mismas», y son menos «dependientes de la mente» que las redescripciones que nos ofrece la crítica contemporánea de la cultura.</w:t>
+        <w:t xml:space="preserve">Para aceptar esta analogía debemos seguir a Mary Hesse en su idea de que las revoluciones científicas son «redescripciones metafóricas» de la naturaleza antes que intelecciones de la naturaleza intrínseca de la naturaleza. Además, debemos resistir a la tendencia de pensar que las redescripciones de la realidad que ofrecen la ciencia física o la ciencia biológica contemporáneas se aproximan de algún modo a «las cosas mismas», y son menos «dependientes de la mente» que las redescripciones que nos ofrece la crítica contemporánea de la cultura.</w:t>
       </w:r>
     </w:p>
     <w:p>
@@ -2212,7 +2318,14 @@
         <w:t xml:space="preserve"> </w:t>
       </w:r>
       <w:r>
-        <w:t xml:space="preserve">Para mi concepción es esencial que no tenemos una conciencia prelingüística a la que el lenguaje deba adecuarse, que no hay una percepción profunda de cómo son las cosas, percepción que sea tarea de los filósofos llevar al lenguaje. Los que se describe como una consciencia así es simplemente una disposición a emplear el lenguaje de nuestros ancestros, a venerar los cadáveres de sus metáforas.</w:t>
+        <w:rPr>
+          <w:bCs/>
+          <w:b/>
+        </w:rPr>
+        <w:t xml:space="preserve">Para mi concepción es esencial que no tenemos una conciencia prelingüística a la que el lenguaje deba adecuarse</w:t>
+      </w:r>
+      <w:r>
+        <w:t xml:space="preserve">, que no hay una percepción profunda de cómo son las cosas, percepción que sea tarea de los filósofos llevar al lenguaje. Los que se describe como una consciencia así es simplemente una disposición a emplear el lenguaje de nuestros ancestros, a venerar los cadáveres de sus metáforas.</w:t>
       </w:r>
     </w:p>
     <w:p>
@@ -2444,7 +2557,20 @@
         <w:pStyle w:val="BodyText"/>
       </w:pPr>
       <w:r>
-        <w:t xml:space="preserve">Las creaciones y el yo de uno no serán sino ejemplos, mejores o peores, de tipo ya conocidos. Eso es lo que Harold Bloom llama «La angustia de influencia del poeta vigoroso».</w:t>
+        <w:t xml:space="preserve">Las creaciones y el yo de uno no serán sino ejemplos, mejores o peores, de tipo ya conocidos. Eso es lo que</w:t>
+      </w:r>
+      <w:r>
+        <w:t xml:space="preserve"> </w:t>
+      </w:r>
+      <w:r>
+        <w:rPr>
+          <w:bCs/>
+          <w:b/>
+        </w:rPr>
+        <w:t xml:space="preserve">Harold Bloom llama «La angustia de influencia del poeta vigoroso</w:t>
+      </w:r>
+      <w:r>
+        <w:t xml:space="preserve">».</w:t>
       </w:r>
     </w:p>
     <w:p>
@@ -2818,15 +2944,39 @@
         <w:pStyle w:val="BodyText"/>
       </w:pPr>
       <w:r>
-        <w:t xml:space="preserve">… Sólo los poetas, sospechaba Nietzsche, pueden apreciar verdaderamente la contingencia. El resto de nosotros está condenado a seguir siendo filósofo, a insistir en que sólo hay un verdadero registro de cargas, una sola descripción verdadera de la condición humana, que nuestras vidas tienen un único contexto universal. Estamos destinados a pasar nuestra vida consciente intentando escapar de la contingencia en lugar de reconocerla y apropiarnos de ella, como hace el poeta vigoroso…</w:t>
-      </w:r>
-    </w:p>
-    <w:p>
-      <w:pPr>
-        <w:pStyle w:val="BodyText"/>
-      </w:pPr>
-      <w:r>
-        <w:t xml:space="preserve">P. 49 Dicho de otro modo; la tradición filosófica occidental concibe la vida humana como un triunfo en la medida en que transmuta el mundo del tiempo, de la apariencia y de la opinión individual en otro mundo: el mundo de la verdad perdurable. Nietzsche, en cambio, cree que el límite que es importante atravesar no es el que separa el tiempo de lo intemporal, sino el que divide lo viejo de lo nuevo. Piensa que la vida humana triunfa en la medida en que escapa de las descripciones heredadas de la contingencia de la existencia y halla nuevas descripciones … la redención como Nietzsche la describe: «Recrear todo “fue” para convertirlo en un así lo quise”». *</w:t>
+        <w:t xml:space="preserve">…</w:t>
+      </w:r>
+      <w:r>
+        <w:t xml:space="preserve"> </w:t>
+      </w:r>
+      <w:r>
+        <w:rPr>
+          <w:bCs/>
+          <w:b/>
+        </w:rPr>
+        <w:t xml:space="preserve">Sólo los poetas, sospechaba Nietzsche, pueden apreciar verdaderamente la contingencia</w:t>
+      </w:r>
+      <w:r>
+        <w:t xml:space="preserve">. El resto de nosotros está condenado a seguir siendo filósofo, a insistir en que sólo hay un verdadero registro de cargas, una sola descripción verdadera de la condición humana, que nuestras vidas tienen un único contexto universal. Estamos destinados a pasar nuestra vida consciente intentando escapar de la contingencia en lugar de reconocerla y apropiarnos de ella, como hace el poeta vigoroso…</w:t>
+      </w:r>
+    </w:p>
+    <w:p>
+      <w:pPr>
+        <w:pStyle w:val="BodyText"/>
+      </w:pPr>
+      <w:r>
+        <w:t xml:space="preserve">P. 49</w:t>
+      </w:r>
+      <w:r>
+        <w:t xml:space="preserve"> </w:t>
+      </w:r>
+    </w:p>
+    <w:p>
+      <w:pPr>
+        <w:pStyle w:val="BodyText"/>
+      </w:pPr>
+      <w:r>
+        <w:t xml:space="preserve">Dicho de otro modo; la tradición filosófica occidental concibe la vida humana como un triunfo en la medida en que transmuta el mundo del tiempo, de la apariencia y de la opinión individual en otro mundo: el mundo de la verdad perdurable. Nietzsche, en cambio, cree que el límite que es importante atravesar no es el que separa el tiempo de lo intemporal, sino el que divide lo viejo de lo nuevo. Piensa que la vida humana triunfa en la medida en que escapa de las descripciones heredadas de la contingencia de la existencia y halla nuevas descripciones … la redención como Nietzsche la describe: «Recrear todo “fue” para convertirlo en un así lo quise”». *</w:t>
       </w:r>
     </w:p>
     <w:p>
@@ -2897,7 +3047,7 @@
         <w:t xml:space="preserve"> </w:t>
       </w:r>
       <w:r>
-        <w:t xml:space="preserve">El drama de una vida humana individual, o de la historia de a humanidad en su conjunto, no es un drama en el cual, triunfante, se alcanza una meta preexistente o, trágicamente, no se alcanza. El trasfondo de tales dramas no es ni una realidad externa constante ni una desfalleciente fuente interior de inspiración. En lugar de ello, concebir la propia vida, o la vida de la propia comunidad, como una narración dramática es concebirla como un nietzscheano proceso de autosuperación. El paradigma de una narración así es la vida del genio que puede decir de la parte relevante de su pasado: «Así lo quise»,</w:t>
+        <w:t xml:space="preserve">El drama de una vida humana individual, o de la historia de la humanidad en su conjunto, no es un drama en el cual, triunfante, se alcanza una meta preexistente o, trágicamente, no se alcanza. El trasfondo de tales dramas no es ni una realidad externa constante ni una desfalleciente fuente interior de inspiración. En lugar de ello, concebir la propia vida, o la vida de la propia comunidad, como una narración dramática es concebirla como un nietzscheano proceso de autosuperación. El paradigma de una narración así es la vida del genio que puede decir de la parte relevante de su pasado: «Así lo quise»,</w:t>
       </w:r>
       <w:r>
         <w:t xml:space="preserve"> </w:t>
@@ -3355,7 +3505,7 @@
         <w:t xml:space="preserve"> </w:t>
       </w:r>
       <w:r>
-        <w:t xml:space="preserve">Kant nos divide en dos partes: una llamada «razón» que es idéntica en todos nosotros, y otra (la sensación empírica y el deseo) que es cuestión de impresiones ciegas, individuales, contingentes. En cambio, Freud trata la racionalidad como un mecanismo que ajusta las contingencias entre sí. Pero su mecanización de la razón no es ya un reduccionismo filosófico más abstracto, o un «platonismo invertido» … Freud pasa su tiempo poniendo de manifiesto ls extraordinaria complejidad, la sutileza y la invectiva de nuestras estrategias inconscientes…</w:t>
+        <w:t xml:space="preserve">Kant nos divide en dos partes: una llamada «razón» que es idéntica en todos nosotros, y otra (la sensación empírica y el deseo) que es cuestión de impresiones ciegas, individuales, contingentes. En cambio, Freud trata la racionalidad como un mecanismo que ajusta las contingencias entre sí. Pero su mecanización de la razón no es ya un reduccionismo filosófico más abstracto, o un «platonismo invertido» … Freud pasa su tiempo poniendo de manifiesto la extraordinaria complejidad, la sutileza y la invectiva de nuestras estrategias inconscientes…</w:t>
       </w:r>
     </w:p>
     <w:p>
@@ -3873,7 +4023,73 @@
         <w:t xml:space="preserve">Pale Fire</w:t>
       </w:r>
       <w:r>
-        <w:t xml:space="preserve">, en torno a la frase: «La vida del hombre es el comentario de un abstruso poema inacabado». Esa frase sirve de resumen de la afirmación de Freud de que toda la vida humana es la elaboración de una complicada fantasía personal, y, a la vez, del recuerdo de que ninguna elaboración así concluye antes de que la muerte la interrumpe. No puede completarse porque no hay nada por completar; sólo hay una trama de relaciones por volver a urdir, una trama que el tiempo prolonga cada día. … la vida humana consiste en volver a urdir … una trama así. Veremos la necesidad consciente que el poeta vigoroso experimente de</w:t>
+        <w:t xml:space="preserve">, en torno a la frase: «</w:t>
+      </w:r>
+      <w:r>
+        <w:rPr>
+          <w:bCs/>
+          <w:b/>
+        </w:rPr>
+        <w:t xml:space="preserve">La vida del hombre es el comentario de un abstruso poema inacabado</w:t>
+      </w:r>
+      <w:r>
+        <w:t xml:space="preserve">». Esa frase sirve de resumen de la afirmación de Freud de que toda la vida humana es la elaboración de una complicada fantasía personal, y, a la vez, del recuerdo de que ninguna elaboración así concluye antes de</w:t>
+      </w:r>
+      <w:r>
+        <w:t xml:space="preserve"> </w:t>
+      </w:r>
+      <w:r>
+        <w:rPr>
+          <w:bCs/>
+          <w:b/>
+        </w:rPr>
+        <w:t xml:space="preserve">que la muerte la interrumpe</w:t>
+      </w:r>
+      <w:r>
+        <w:t xml:space="preserve">. No puede completarse</w:t>
+      </w:r>
+      <w:r>
+        <w:t xml:space="preserve"> </w:t>
+      </w:r>
+      <w:r>
+        <w:rPr>
+          <w:bCs/>
+          <w:b/>
+        </w:rPr>
+        <w:t xml:space="preserve">porque no hay nada por completar</w:t>
+      </w:r>
+      <w:r>
+        <w:t xml:space="preserve">; s</w:t>
+      </w:r>
+      <w:r>
+        <w:rPr>
+          <w:bCs/>
+          <w:b/>
+        </w:rPr>
+        <w:t xml:space="preserve">ólo hay una trama de relaciones por volver a urdir, una trama que el tiempo prolonga cada día</w:t>
+      </w:r>
+      <w:r>
+        <w:t xml:space="preserve">. …</w:t>
+      </w:r>
+      <w:r>
+        <w:rPr>
+          <w:bCs/>
+          <w:b/>
+        </w:rPr>
+        <w:t xml:space="preserve"> </w:t>
+      </w:r>
+      <w:r>
+        <w:rPr>
+          <w:bCs/>
+          <w:b/>
+        </w:rPr>
+        <w:t xml:space="preserve">la vida humana consiste en volver a urdir</w:t>
+      </w:r>
+      <w:r>
+        <w:t xml:space="preserve"> </w:t>
+      </w:r>
+      <w:r>
+        <w:t xml:space="preserve">… una trama así. Veremos la necesidad consciente que el poeta vigoroso experimente de</w:t>
       </w:r>
       <w:r>
         <w:t xml:space="preserve"> </w:t>
@@ -3962,71 +4178,13 @@
         <w:t xml:space="preserve"> </w:t>
       </w:r>
       <w:r>
-        <w:t xml:space="preserve">La victoria final de la poesía en su antigua disputa con la filosofía —la victoria final de las metáforas de creación de sí mismo sobre las metáforas de descubrimiento— residía en nuestra reconciliación con la idea de que esa es la única especia de poder que podemos esperar sobre nuestro mundo.</w:t>
-      </w:r>
-    </w:p>
-    <w:p>
-      <w:pPr>
-        <w:pStyle w:val="BodyText"/>
-      </w:pPr>
-      <w:r>
-        <w:rPr>
-          <w:bCs/>
-          <w:b/>
-        </w:rPr>
-        <w:t xml:space="preserve">RORTY, Richard</w:t>
-      </w:r>
-      <w:r>
-        <w:t xml:space="preserve"> </w:t>
-      </w:r>
-      <w:r>
-        <w:t xml:space="preserve">(1991).</w:t>
-      </w:r>
-      <w:r>
-        <w:rPr>
-          <w:iCs/>
-          <w:i/>
-        </w:rPr>
-        <w:t xml:space="preserve">Contingencia, ironía y solidaridad. Barcelona: Paidós.</w:t>
-      </w:r>
-    </w:p>
-    <w:p>
-      <w:pPr>
-        <w:pStyle w:val="BodyText"/>
-      </w:pPr>
-      <w:r>
-        <w:t xml:space="preserve">P. 60</w:t>
-      </w:r>
-    </w:p>
-    <w:p>
-      <w:pPr>
-        <w:pStyle w:val="BodyText"/>
-      </w:pPr>
-      <w:r>
-        <w:t xml:space="preserve"> </w:t>
-      </w:r>
-      <w:r>
-        <w:t xml:space="preserve">Enfrentarnos con lo humano, con lo no lingüístico, no disponemos ya de la capacidad de superar la contingencia y la aflicción mediante la apropiación y la transformación, sino sólo la capacidad de reconocer la contingencia y el dolor.</w:t>
-      </w:r>
-    </w:p>
-    <w:p>
-      <w:pPr>
-        <w:pStyle w:val="BodyText"/>
-      </w:pPr>
-      <w:r>
-        <w:t xml:space="preserve"> </w:t>
-      </w:r>
-    </w:p>
-    <w:p>
-      <w:pPr>
-        <w:pStyle w:val="BodyText"/>
-      </w:pPr>
-      <w:r>
-        <w:t xml:space="preserve"> </w:t>
-      </w:r>
-      <w:r>
-        <w:t xml:space="preserve">La victoria final de la poesía en su antigua disputa con la filosofía —la victoria final de las metáforas de creación de sí mismo sobre las metáforas de descubrimiento— residiría en nuestra reconciliación de con la idea de que esa es la única especia de poder que podemos esperar tener sobre el mundo.</w:t>
-      </w:r>
+        <w:t xml:space="preserve">La victoria final de la poesía en su antigua disputa con la filosofía —la victoria final de las metáforas de creación de sí mismo sobre las metáforas de descubrimiento— residía en nuestra reconciliación con la idea de que esa es la única especie de poder que podemos esperar sobre nuestro mundo.</w:t>
+      </w:r>
+    </w:p>
+    <w:p>
+      <w:pPr>
+        <w:pStyle w:val="BodyText"/>
+      </w:pPr>
     </w:p>
     <w:sectPr/>
   </w:body>

</xml_diff>